<commit_message>
Add certificate pictures, Intro to Cybersecurity cert and PSC XI finalist; feature SolarCORE on home page; remove DOCX download
</commit_message>
<xml_diff>
--- a/assets/Stefane-Cerezo-Resume-ATS.docx
+++ b/assets/Stefane-Cerezo-Resume-ATS.docx
@@ -376,7 +376,7 @@
             <w:color w:val="0563C1"/>
             <w:u w:val="single"/>
           </w:rPr>
-          <w:t>github.com/stfcrz11/SolarCORE_docs</w:t>
+          <w:t>stfcrz11.github.io/SolarCORE_docs</w:t>
         </w:r>
       </w:hyperlink>
     </w:p>
@@ -661,6 +661,90 @@
           <w:b/>
           <w:bCs/>
         </w:rPr>
+        <w:t>Introduction to Cybersecurity, Cisco Networking Academy</w:t>
+      </w:r>
+      <w:r>
+        <w:rPr>
+          <w:b/>
+          <w:bCs/>
+        </w:rPr>
+        <w:tab/>
+        <w:t>October 2026</w:t>
+      </w:r>
+    </w:p>
+    <w:p>
+      <w:r>
+        <w:rPr>
+          <w:i/>
+          <w:iCs/>
+        </w:rPr>
+        <w:t xml:space="preserve">Credential: </w:t>
+      </w:r>
+      <w:hyperlink r:id="rId16" w:history="1">
+        <w:r>
+          <w:rPr>
+            <w:color w:val="0563C1"/>
+            <w:u w:val="single"/>
+          </w:rPr>
+          <w:t>netacad.com/certificates (issuance f925a05a-7327-44f2-86c5-5dfe56038d54)</w:t>
+        </w:r>
+      </w:hyperlink>
+    </w:p>
+    <w:p>
+      <w:pPr>
+        <w:keepNext/>
+        <w:tabs>
+          <w:tab w:val="right" w:pos="10080"/>
+        </w:tabs>
+        <w:spacing w:before="40"/>
+      </w:pPr>
+      <w:r>
+        <w:rPr>
+          <w:b/>
+          <w:bCs/>
+        </w:rPr>
+        <w:t>Network Support and Security, Cisco Networking Academy</w:t>
+      </w:r>
+      <w:r>
+        <w:rPr>
+          <w:b/>
+          <w:bCs/>
+        </w:rPr>
+        <w:tab/>
+        <w:t>October 2026</w:t>
+      </w:r>
+    </w:p>
+    <w:p>
+      <w:r>
+        <w:rPr>
+          <w:i/>
+          <w:iCs/>
+        </w:rPr>
+        <w:t xml:space="preserve">Credential: </w:t>
+      </w:r>
+      <w:hyperlink r:id="rId13" w:history="1">
+        <w:r>
+          <w:rPr>
+            <w:color w:val="0563C1"/>
+            <w:u w:val="single"/>
+          </w:rPr>
+          <w:t>netacad.com/certificates (issuance d34c61c6-ace0-412f-afc3-43d438178b63)</w:t>
+        </w:r>
+      </w:hyperlink>
+    </w:p>
+    <w:p>
+      <w:pPr>
+        <w:keepNext/>
+        <w:tabs>
+          <w:tab w:val="right" w:pos="10080"/>
+        </w:tabs>
+        <w:spacing w:before="40"/>
+      </w:pPr>
+      <w:r>
+        <w:rPr>
+          <w:b/>
+          <w:bCs/>
+        </w:rPr>
         <w:t>NetOps Certified Engineer (NTO-101), AppKademiya</w:t>
       </w:r>
       <w:r>
@@ -669,7 +753,7 @@
           <w:bCs/>
         </w:rPr>
         <w:tab/>
-        <w:t>2026</w:t>
+        <w:t>September 2026</w:t>
       </w:r>
     </w:p>
     <w:p>
@@ -693,40 +777,6 @@
     <w:p>
       <w:pPr>
         <w:keepNext/>
-        <w:tabs>
-          <w:tab w:val="right" w:pos="10080"/>
-        </w:tabs>
-        <w:spacing w:before="40"/>
-      </w:pPr>
-      <w:r>
-        <w:rPr>
-          <w:b/>
-          <w:bCs/>
-        </w:rPr>
-        <w:t>Network Support and Security, Cisco Networking Academy</w:t>
-      </w:r>
-    </w:p>
-    <w:p>
-      <w:r>
-        <w:rPr>
-          <w:i/>
-          <w:iCs/>
-        </w:rPr>
-        <w:t xml:space="preserve">Credential: </w:t>
-      </w:r>
-      <w:hyperlink r:id="rId13" w:history="1">
-        <w:r>
-          <w:rPr>
-            <w:color w:val="0563C1"/>
-            <w:u w:val="single"/>
-          </w:rPr>
-          <w:t>netacad.com/certificates (issuance d34c61c6-ace0-412f-afc3-43d438178b63)</w:t>
-        </w:r>
-      </w:hyperlink>
-    </w:p>
-    <w:p>
-      <w:pPr>
-        <w:keepNext/>
         <w:pBdr>
           <w:bottom w:val="single" w:sz="6" w:space="1" w:color="000000"/>
         </w:pBdr>
@@ -746,6 +796,57 @@
         <w:tabs>
           <w:tab w:val="right" w:pos="10080"/>
         </w:tabs>
+      </w:pPr>
+      <w:r>
+        <w:rPr>
+          <w:b/>
+          <w:bCs/>
+        </w:rPr>
+        <w:t>Philippine Startup Challenge XI (PSC XI): Regional Pitching Competition, DICT – Region 2</w:t>
+      </w:r>
+      <w:r>
+        <w:rPr>
+          <w:b/>
+          <w:bCs/>
+        </w:rPr>
+        <w:tab/>
+        <w:t>October 2026</w:t>
+      </w:r>
+    </w:p>
+    <w:p>
+      <w:pPr>
+        <w:keepNext/>
+        <w:tabs>
+          <w:tab w:val="right" w:pos="10080"/>
+        </w:tabs>
+      </w:pPr>
+      <w:r>
+        <w:rPr>
+          <w:i/>
+          <w:iCs/>
+        </w:rPr>
+        <w:t>Regional Finalist, Student Category (Team)  |  Lead Developer</w:t>
+      </w:r>
+    </w:p>
+    <w:p>
+      <w:pPr>
+        <w:pStyle w:val="ListParagraph"/>
+        <w:numPr>
+          <w:ilvl w:val="0"/>
+          <w:numId w:val="2"/>
+        </w:numPr>
+      </w:pPr>
+      <w:r>
+        <w:t>Pitched SolarCORE, our GIS-based solar installation tracking system, as one of the regional student finalists.</w:t>
+      </w:r>
+    </w:p>
+    <w:p>
+      <w:pPr>
+        <w:keepNext/>
+        <w:tabs>
+          <w:tab w:val="right" w:pos="10080"/>
+        </w:tabs>
+        <w:spacing w:before="40"/>
       </w:pPr>
       <w:r>
         <w:rPr>

</xml_diff>